<commit_message>
ya funciona el inject de excel
</commit_message>
<xml_diff>
--- a/data/templates/memory.docx
+++ b/data/templates/memory.docx
@@ -78,7 +78,7 @@
                         <v:path o:extrusionok="f" gradientshapeok="t" o:connecttype="rect"/>
                         <o:lock v:ext="edit" aspectratio="t"/>
                       </v:shapetype>
-                      <v:shape id="_x0000_i1025" type="#_x0000_t75" alt="logo_g" style="width:226.2pt;height:112.2pt;visibility:visible">
+                      <v:shape id="_x0000_i1026" type="#_x0000_t75" alt="logo_g" style="width:226.2pt;height:112.2pt;visibility:visible">
                         <v:imagedata r:id="rId7" o:title="logo_g"/>
                       </v:shape>
                     </w:pict>
@@ -203,7 +203,7 @@
           <w:noProof/>
         </w:rPr>
         <w:pict w14:anchorId="59C1AEF7">
-          <v:shape id="Imagen 1" o:spid="_x0000_i1026" type="#_x0000_t75" style="width:88.8pt;height:88.8pt;visibility:visible">
+          <v:shape id="Imagen 1" o:spid="_x0000_i1027" type="#_x0000_t75" style="width:88.8pt;height:88.8pt;visibility:visible">
             <v:imagedata r:id="rId8" o:title="LOGOTIPOFCDIAMANTE[1]"/>
           </v:shape>
         </w:pict>
@@ -231,7 +231,7 @@
           <w:noProof/>
         </w:rPr>
         <w:pict w14:anchorId="76621883">
-          <v:shape id="_x0000_i1027" type="#_x0000_t75" style="width:247.8pt;height:52.8pt;visibility:visible">
+          <v:shape id="_x0000_i1028" type="#_x0000_t75" style="width:247.8pt;height:52.8pt;visibility:visible">
             <v:imagedata r:id="rId9" o:title=""/>
           </v:shape>
         </w:pict>
@@ -531,11 +531,35 @@
         <w:rPr>
           <w:rFonts w:ascii="Verdana" w:hAnsi="Verdana"/>
         </w:rPr>
+        <w:fldChar w:fldCharType="begin"/>
+      </w:r>
+      <w:r>
+        <w:rPr>
+          <w:rFonts w:ascii="Verdana" w:hAnsi="Verdana"/>
+        </w:rPr>
+        <w:instrText xml:space="preserve"> INCLUDEPICTURE  "http://campus.fspaugtformacion.org/imgs2/spacer.png" \* MERGEFORMATINET </w:instrText>
+      </w:r>
+      <w:r>
+        <w:rPr>
+          <w:rFonts w:ascii="Verdana" w:hAnsi="Verdana"/>
+        </w:rPr>
+        <w:fldChar w:fldCharType="separate"/>
+      </w:r>
+      <w:r>
+        <w:rPr>
+          <w:rFonts w:ascii="Verdana" w:hAnsi="Verdana"/>
+        </w:rPr>
         <w:pict w14:anchorId="2C53512D">
-          <v:shape id="_x0000_i1028" type="#_x0000_t75" style="width:.6pt;height:.6pt">
+          <v:shape id="_x0000_i1029" type="#_x0000_t75" style="width:.6pt;height:.6pt">
             <v:imagedata r:id="rId16" r:href="rId17"/>
           </v:shape>
         </w:pict>
+      </w:r>
+      <w:r>
+        <w:rPr>
+          <w:rFonts w:ascii="Verdana" w:hAnsi="Verdana"/>
+        </w:rPr>
+        <w:fldChar w:fldCharType="end"/>
       </w:r>
       <w:r>
         <w:rPr>
@@ -1628,7 +1652,7 @@
     </w:p>
     <w:tbl>
       <w:tblPr>
-        <w:tblW w:w="9781" w:type="dxa"/>
+        <w:tblW w:w="7513" w:type="dxa"/>
         <w:tblInd w:w="-34" w:type="dxa"/>
         <w:tblBorders>
           <w:top w:val="single" w:sz="4" w:space="0" w:color="auto"/>
@@ -1646,8 +1670,6 @@
         <w:gridCol w:w="1701"/>
         <w:gridCol w:w="1134"/>
         <w:gridCol w:w="1276"/>
-        <w:gridCol w:w="1134"/>
-        <w:gridCol w:w="1134"/>
         <w:gridCol w:w="1275"/>
       </w:tblGrid>
       <w:tr>
@@ -1777,78 +1799,6 @@
         </w:tc>
         <w:tc>
           <w:tcPr>
-            <w:tcW w:w="1134" w:type="dxa"/>
-            <w:shd w:val="clear" w:color="auto" w:fill="948A54"/>
-            <w:vAlign w:val="center"/>
-          </w:tcPr>
-          <w:p>
-            <w:pPr>
-              <w:jc w:val="center"/>
-              <w:rPr>
-                <w:rFonts w:ascii="Calibri" w:hAnsi="Calibri"/>
-                <w:b/>
-                <w:sz w:val="16"/>
-                <w:szCs w:val="16"/>
-              </w:rPr>
-            </w:pPr>
-            <w:r>
-              <w:rPr>
-                <w:rFonts w:ascii="Calibri" w:hAnsi="Calibri"/>
-                <w:b/>
-                <w:sz w:val="16"/>
-                <w:szCs w:val="16"/>
-              </w:rPr>
-              <w:t>EVALUACIÓN</w:t>
-            </w:r>
-            <w:r>
-              <w:rPr>
-                <w:rFonts w:ascii="Calibri" w:hAnsi="Calibri"/>
-                <w:b/>
-                <w:sz w:val="16"/>
-                <w:szCs w:val="16"/>
-              </w:rPr>
-              <w:t xml:space="preserve">  3</w:t>
-            </w:r>
-          </w:p>
-        </w:tc>
-        <w:tc>
-          <w:tcPr>
-            <w:tcW w:w="1134" w:type="dxa"/>
-            <w:shd w:val="clear" w:color="auto" w:fill="948A54"/>
-            <w:vAlign w:val="center"/>
-          </w:tcPr>
-          <w:p>
-            <w:pPr>
-              <w:jc w:val="center"/>
-              <w:rPr>
-                <w:rFonts w:ascii="Calibri" w:hAnsi="Calibri"/>
-                <w:b/>
-                <w:sz w:val="16"/>
-                <w:szCs w:val="16"/>
-              </w:rPr>
-            </w:pPr>
-            <w:r>
-              <w:rPr>
-                <w:rFonts w:ascii="Calibri" w:hAnsi="Calibri"/>
-                <w:b/>
-                <w:sz w:val="16"/>
-                <w:szCs w:val="16"/>
-              </w:rPr>
-              <w:t>EVALUACIÓN</w:t>
-            </w:r>
-            <w:r>
-              <w:rPr>
-                <w:rFonts w:ascii="Calibri" w:hAnsi="Calibri"/>
-                <w:b/>
-                <w:sz w:val="16"/>
-                <w:szCs w:val="16"/>
-              </w:rPr>
-              <w:t xml:space="preserve"> 4</w:t>
-            </w:r>
-          </w:p>
-        </w:tc>
-        <w:tc>
-          <w:tcPr>
             <w:tcW w:w="1275" w:type="dxa"/>
             <w:shd w:val="clear" w:color="auto" w:fill="948A54"/>
             <w:vAlign w:val="center"/>
@@ -1892,31 +1842,35 @@
                 <w:b/>
                 <w:lang w:val="en-GB"/>
               </w:rPr>
-              <w:t xml:space="preserve">{%tr for student in students </w:t>
-            </w:r>
-            <w:proofErr w:type="gramStart"/>
-            <w:r>
+              <w:t>{%tr for student in students %}{{ student.full_name_v2 }}</w:t>
+            </w:r>
+          </w:p>
+        </w:tc>
+        <w:tc>
+          <w:tcPr>
+            <w:tcW w:w="1701" w:type="dxa"/>
+          </w:tcPr>
+          <w:p>
+            <w:pPr>
               <w:rPr>
                 <w:rFonts w:ascii="Verdana" w:hAnsi="Verdana"/>
                 <w:b/>
                 <w:lang w:val="en-GB"/>
               </w:rPr>
-              <w:t>%}{{ student</w:t>
-            </w:r>
-            <w:proofErr w:type="gramEnd"/>
+            </w:pPr>
             <w:r>
               <w:rPr>
                 <w:rFonts w:ascii="Verdana" w:hAnsi="Verdana"/>
                 <w:b/>
                 <w:lang w:val="en-GB"/>
               </w:rPr>
-              <w:t>.full_name_v2 }}</w:t>
-            </w:r>
-          </w:p>
-        </w:tc>
-        <w:tc>
-          <w:tcPr>
-            <w:tcW w:w="1701" w:type="dxa"/>
+              <w:t>{{ student.dni }}</w:t>
+            </w:r>
+          </w:p>
+        </w:tc>
+        <w:tc>
+          <w:tcPr>
+            <w:tcW w:w="1134" w:type="dxa"/>
           </w:tcPr>
           <w:p>
             <w:pPr>
@@ -1926,29 +1880,57 @@
                 <w:lang w:val="en-GB"/>
               </w:rPr>
             </w:pPr>
-            <w:proofErr w:type="gramStart"/>
             <w:r>
               <w:rPr>
                 <w:rFonts w:ascii="Verdana" w:hAnsi="Verdana"/>
                 <w:b/>
                 <w:lang w:val="en-GB"/>
               </w:rPr>
-              <w:t>{{ student.dni</w:t>
-            </w:r>
-            <w:proofErr w:type="gramEnd"/>
-            <w:r>
+              <w:t>{{ student.ev1 }}</w:t>
+            </w:r>
+          </w:p>
+        </w:tc>
+        <w:tc>
+          <w:tcPr>
+            <w:tcW w:w="1276" w:type="dxa"/>
+          </w:tcPr>
+          <w:p>
+            <w:pPr>
               <w:rPr>
                 <w:rFonts w:ascii="Verdana" w:hAnsi="Verdana"/>
                 <w:b/>
                 <w:lang w:val="en-GB"/>
               </w:rPr>
+            </w:pPr>
+            <w:r>
+              <w:rPr>
+                <w:rFonts w:ascii="Verdana" w:hAnsi="Verdana"/>
+                <w:b/>
+                <w:lang w:val="en-GB"/>
+              </w:rPr>
+              <w:t>{{ student.ev</w:t>
+            </w:r>
+            <w:r>
+              <w:rPr>
+                <w:rFonts w:ascii="Verdana" w:hAnsi="Verdana"/>
+                <w:b/>
+                <w:lang w:val="en-GB"/>
+              </w:rPr>
+              <w:t>2</w:t>
+            </w:r>
+            <w:r>
+              <w:rPr>
+                <w:rFonts w:ascii="Verdana" w:hAnsi="Verdana"/>
+                <w:b/>
+                <w:lang w:val="en-GB"/>
+              </w:rPr>
               <w:t xml:space="preserve"> }}</w:t>
             </w:r>
           </w:p>
         </w:tc>
         <w:tc>
           <w:tcPr>
-            <w:tcW w:w="1134" w:type="dxa"/>
+            <w:tcW w:w="1275" w:type="dxa"/>
           </w:tcPr>
           <w:p>
             <w:pPr>
@@ -1958,239 +1940,36 @@
                 <w:lang w:val="en-GB"/>
               </w:rPr>
             </w:pPr>
-            <w:proofErr w:type="gramStart"/>
             <w:r>
               <w:rPr>
                 <w:rFonts w:ascii="Verdana" w:hAnsi="Verdana"/>
                 <w:b/>
                 <w:lang w:val="en-GB"/>
               </w:rPr>
-              <w:t>{{ student.ev1</w:t>
-            </w:r>
-            <w:proofErr w:type="gramEnd"/>
+              <w:t>{{ studen</w:t>
+            </w:r>
             <w:r>
               <w:rPr>
                 <w:rFonts w:ascii="Verdana" w:hAnsi="Verdana"/>
                 <w:b/>
                 <w:lang w:val="en-GB"/>
               </w:rPr>
-              <w:t xml:space="preserve"> }}</w:t>
-            </w:r>
-          </w:p>
-        </w:tc>
-        <w:tc>
-          <w:tcPr>
-            <w:tcW w:w="1276" w:type="dxa"/>
-          </w:tcPr>
-          <w:p>
-            <w:pPr>
+              <w:t>t.evf</w:t>
+            </w:r>
+            <w:r>
               <w:rPr>
                 <w:rFonts w:ascii="Verdana" w:hAnsi="Verdana"/>
                 <w:b/>
                 <w:lang w:val="en-GB"/>
               </w:rPr>
-            </w:pPr>
-            <w:proofErr w:type="gramStart"/>
+              <w:t>}}</w:t>
+            </w:r>
             <w:r>
               <w:rPr>
                 <w:rFonts w:ascii="Verdana" w:hAnsi="Verdana"/>
                 <w:b/>
-                <w:lang w:val="en-GB"/>
-              </w:rPr>
-              <w:t>{{ student.ev</w:t>
-            </w:r>
-            <w:r>
-              <w:rPr>
-                <w:rFonts w:ascii="Verdana" w:hAnsi="Verdana"/>
-                <w:b/>
-                <w:lang w:val="en-GB"/>
-              </w:rPr>
-              <w:t>2</w:t>
-            </w:r>
-            <w:proofErr w:type="gramEnd"/>
-            <w:r>
-              <w:rPr>
-                <w:rFonts w:ascii="Verdana" w:hAnsi="Verdana"/>
-                <w:b/>
-                <w:lang w:val="en-GB"/>
-              </w:rPr>
-              <w:t xml:space="preserve"> }}</w:t>
-            </w:r>
-          </w:p>
-        </w:tc>
-        <w:tc>
-          <w:tcPr>
-            <w:tcW w:w="1134" w:type="dxa"/>
-          </w:tcPr>
-          <w:p>
-            <w:pPr>
-              <w:rPr>
-                <w:rFonts w:ascii="Verdana" w:hAnsi="Verdana"/>
-                <w:b/>
-                <w:lang w:val="en-GB"/>
-              </w:rPr>
-            </w:pPr>
-            <w:proofErr w:type="gramStart"/>
-            <w:r>
-              <w:rPr>
-                <w:rFonts w:ascii="Verdana" w:hAnsi="Verdana"/>
-                <w:b/>
-                <w:lang w:val="en-GB"/>
-              </w:rPr>
-              <w:t>{{ student.ev</w:t>
-            </w:r>
-            <w:r>
-              <w:rPr>
-                <w:rFonts w:ascii="Verdana" w:hAnsi="Verdana"/>
-                <w:b/>
-                <w:lang w:val="en-GB"/>
-              </w:rPr>
-              <w:t>3</w:t>
-            </w:r>
-            <w:proofErr w:type="gramEnd"/>
-            <w:r>
-              <w:rPr>
-                <w:rFonts w:ascii="Verdana" w:hAnsi="Verdana"/>
-                <w:b/>
-                <w:lang w:val="en-GB"/>
-              </w:rPr>
-              <w:t xml:space="preserve"> }}</w:t>
-            </w:r>
-          </w:p>
-        </w:tc>
-        <w:tc>
-          <w:tcPr>
-            <w:tcW w:w="1134" w:type="dxa"/>
-          </w:tcPr>
-          <w:p>
-            <w:pPr>
-              <w:rPr>
-                <w:rFonts w:ascii="Verdana" w:hAnsi="Verdana"/>
-                <w:b/>
-                <w:lang w:val="en-GB"/>
-              </w:rPr>
-            </w:pPr>
-            <w:proofErr w:type="gramStart"/>
-            <w:r>
-              <w:rPr>
-                <w:rFonts w:ascii="Verdana" w:hAnsi="Verdana"/>
-                <w:b/>
-                <w:lang w:val="en-GB"/>
-              </w:rPr>
-              <w:t>{{ student.ev</w:t>
-            </w:r>
-            <w:r>
-              <w:rPr>
-                <w:rFonts w:ascii="Verdana" w:hAnsi="Verdana"/>
-                <w:b/>
-                <w:lang w:val="en-GB"/>
-              </w:rPr>
-              <w:t>4</w:t>
-            </w:r>
-            <w:proofErr w:type="gramEnd"/>
-            <w:r>
-              <w:rPr>
-                <w:rFonts w:ascii="Verdana" w:hAnsi="Verdana"/>
-                <w:b/>
-                <w:lang w:val="en-GB"/>
-              </w:rPr>
-              <w:t xml:space="preserve"> }}</w:t>
-            </w:r>
-          </w:p>
-        </w:tc>
-        <w:tc>
-          <w:tcPr>
-            <w:tcW w:w="1275" w:type="dxa"/>
-          </w:tcPr>
-          <w:p>
-            <w:pPr>
-              <w:rPr>
-                <w:rFonts w:ascii="Verdana" w:hAnsi="Verdana"/>
-                <w:b/>
-                <w:lang w:val="en-GB"/>
-              </w:rPr>
-            </w:pPr>
-            <w:proofErr w:type="gramStart"/>
-            <w:r>
-              <w:rPr>
-                <w:rFonts w:ascii="Verdana" w:hAnsi="Verdana"/>
-                <w:b/>
-                <w:lang w:val="en-GB"/>
-              </w:rPr>
-              <w:t xml:space="preserve">{{ </w:t>
-            </w:r>
-            <w:proofErr w:type="spellStart"/>
-            <w:r>
-              <w:rPr>
-                <w:rFonts w:ascii="Verdana" w:hAnsi="Verdana"/>
-                <w:b/>
-                <w:lang w:val="en-GB"/>
-              </w:rPr>
-              <w:t>studen</w:t>
-            </w:r>
-            <w:r>
-              <w:rPr>
-                <w:rFonts w:ascii="Verdana" w:hAnsi="Verdana"/>
-                <w:b/>
-                <w:lang w:val="en-GB"/>
-              </w:rPr>
-              <w:t>t.evf</w:t>
-            </w:r>
-            <w:proofErr w:type="spellEnd"/>
-            <w:r>
-              <w:rPr>
-                <w:rFonts w:ascii="Verdana" w:hAnsi="Verdana"/>
-                <w:b/>
-                <w:lang w:val="en-GB"/>
-              </w:rPr>
-              <w:t>}}</w:t>
-            </w:r>
-            <w:r>
-              <w:rPr>
-                <w:rFonts w:ascii="Verdana" w:hAnsi="Verdana"/>
-                <w:b/>
-              </w:rPr>
-              <w:t>{</w:t>
-            </w:r>
-            <w:proofErr w:type="gramEnd"/>
-            <w:r>
-              <w:rPr>
-                <w:rFonts w:ascii="Verdana" w:hAnsi="Verdana"/>
-                <w:b/>
-              </w:rPr>
-              <w:t>%</w:t>
-            </w:r>
-            <w:proofErr w:type="spellStart"/>
-            <w:r>
-              <w:rPr>
-                <w:rFonts w:ascii="Verdana" w:hAnsi="Verdana"/>
-                <w:b/>
-              </w:rPr>
-              <w:t>tr</w:t>
-            </w:r>
-            <w:proofErr w:type="spellEnd"/>
-            <w:r>
-              <w:rPr>
-                <w:rFonts w:ascii="Verdana" w:hAnsi="Verdana"/>
-                <w:b/>
-              </w:rPr>
-              <w:t xml:space="preserve"> </w:t>
-            </w:r>
-            <w:proofErr w:type="spellStart"/>
-            <w:r>
-              <w:rPr>
-                <w:rFonts w:ascii="Verdana" w:hAnsi="Verdana"/>
-                <w:b/>
-              </w:rPr>
-              <w:t>endfor</w:t>
-            </w:r>
-            <w:proofErr w:type="spellEnd"/>
-            <w:r>
-              <w:rPr>
-                <w:rFonts w:ascii="Verdana" w:hAnsi="Verdana"/>
-                <w:b/>
-              </w:rPr>
-              <w:t xml:space="preserve"> %}</w:t>
+              </w:rPr>
+              <w:t>{%tr endfor %}</w:t>
             </w:r>
           </w:p>
         </w:tc>
@@ -2213,23 +1992,13 @@
           <w:sz w:val="18"/>
         </w:rPr>
       </w:pPr>
-      <w:proofErr w:type="gramStart"/>
       <w:r>
         <w:rPr>
           <w:rFonts w:ascii="Verdana" w:hAnsi="Verdana"/>
           <w:b/>
           <w:sz w:val="18"/>
         </w:rPr>
-        <w:t>TOTAL</w:t>
-      </w:r>
-      <w:proofErr w:type="gramEnd"/>
-      <w:r>
-        <w:rPr>
-          <w:rFonts w:ascii="Verdana" w:hAnsi="Verdana"/>
-          <w:b/>
-          <w:sz w:val="18"/>
-        </w:rPr>
-        <w:t xml:space="preserve"> ALUMNADO</w:t>
+        <w:t>TOTAL ALUMNADO</w:t>
       </w:r>
       <w:r>
         <w:rPr>
@@ -2288,23 +2057,13 @@
           <w:b/>
         </w:rPr>
       </w:pPr>
-      <w:proofErr w:type="gramStart"/>
       <w:r>
         <w:rPr>
           <w:rFonts w:ascii="Verdana" w:hAnsi="Verdana"/>
           <w:b/>
           <w:sz w:val="18"/>
         </w:rPr>
-        <w:t>TOTAL</w:t>
-      </w:r>
-      <w:proofErr w:type="gramEnd"/>
-      <w:r>
-        <w:rPr>
-          <w:rFonts w:ascii="Verdana" w:hAnsi="Verdana"/>
-          <w:b/>
-          <w:sz w:val="18"/>
-        </w:rPr>
-        <w:t xml:space="preserve"> ALUMNADO APTO:</w:t>
+        <w:t>TOTAL ALUMNADO APTO:</w:t>
       </w:r>
       <w:r>
         <w:rPr>
@@ -2356,23 +2115,13 @@
           <w:sz w:val="18"/>
         </w:rPr>
       </w:pPr>
-      <w:proofErr w:type="gramStart"/>
       <w:r>
         <w:rPr>
           <w:rFonts w:ascii="Verdana" w:hAnsi="Verdana"/>
           <w:b/>
           <w:sz w:val="18"/>
         </w:rPr>
-        <w:t>TOTAL</w:t>
-      </w:r>
-      <w:proofErr w:type="gramEnd"/>
-      <w:r>
-        <w:rPr>
-          <w:rFonts w:ascii="Verdana" w:hAnsi="Verdana"/>
-          <w:b/>
-          <w:sz w:val="18"/>
-        </w:rPr>
-        <w:t xml:space="preserve"> ALUMNADO NO APTO</w:t>
+        <w:t>TOTAL ALUMNADO NO APTO</w:t>
       </w:r>
       <w:r>
         <w:rPr>
@@ -2424,23 +2173,13 @@
           <w:sz w:val="18"/>
         </w:rPr>
       </w:pPr>
-      <w:proofErr w:type="gramStart"/>
       <w:r>
         <w:rPr>
           <w:rFonts w:ascii="Verdana" w:hAnsi="Verdana"/>
           <w:b/>
           <w:sz w:val="18"/>
         </w:rPr>
-        <w:t>TOTAL</w:t>
-      </w:r>
-      <w:proofErr w:type="gramEnd"/>
-      <w:r>
-        <w:rPr>
-          <w:rFonts w:ascii="Verdana" w:hAnsi="Verdana"/>
-          <w:b/>
-          <w:sz w:val="18"/>
-        </w:rPr>
-        <w:t xml:space="preserve"> ABANDONOS:</w:t>
+        <w:t>TOTAL ABANDONOS:</w:t>
       </w:r>
       <w:r>
         <w:rPr>
@@ -2684,131 +2423,52 @@
                 <w:b/>
                 <w:lang w:val="en-GB"/>
               </w:rPr>
-              <w:t xml:space="preserve">{%tr for student in students </w:t>
-            </w:r>
-            <w:proofErr w:type="gramStart"/>
-            <w:r>
+              <w:t>{%tr for student in students %}{{ student.full_name_v2 }}</w:t>
+            </w:r>
+          </w:p>
+        </w:tc>
+        <w:tc>
+          <w:tcPr>
+            <w:tcW w:w="2584" w:type="dxa"/>
+          </w:tcPr>
+          <w:p>
+            <w:pPr>
               <w:rPr>
                 <w:rFonts w:ascii="Verdana" w:hAnsi="Verdana"/>
                 <w:b/>
                 <w:lang w:val="en-GB"/>
               </w:rPr>
-              <w:t>%}{{ student</w:t>
-            </w:r>
-            <w:proofErr w:type="gramEnd"/>
+            </w:pPr>
             <w:r>
               <w:rPr>
                 <w:rFonts w:ascii="Verdana" w:hAnsi="Verdana"/>
                 <w:b/>
                 <w:lang w:val="en-GB"/>
               </w:rPr>
-              <w:t>.full_name_v2 }}</w:t>
-            </w:r>
-          </w:p>
-        </w:tc>
-        <w:tc>
-          <w:tcPr>
-            <w:tcW w:w="2584" w:type="dxa"/>
-          </w:tcPr>
-          <w:p>
-            <w:pPr>
+              <w:t>{{ student.</w:t>
+            </w:r>
+            <w:r>
               <w:rPr>
                 <w:rFonts w:ascii="Verdana" w:hAnsi="Verdana"/>
                 <w:b/>
                 <w:lang w:val="en-GB"/>
               </w:rPr>
-            </w:pPr>
-            <w:proofErr w:type="gramStart"/>
+              <w:t>time</w:t>
+            </w:r>
             <w:r>
               <w:rPr>
                 <w:rFonts w:ascii="Verdana" w:hAnsi="Verdana"/>
                 <w:b/>
                 <w:lang w:val="en-GB"/>
               </w:rPr>
-              <w:t xml:space="preserve">{{ </w:t>
-            </w:r>
-            <w:proofErr w:type="spellStart"/>
+              <w:t xml:space="preserve"> }}</w:t>
+            </w:r>
             <w:r>
               <w:rPr>
                 <w:rFonts w:ascii="Verdana" w:hAnsi="Verdana"/>
                 <w:b/>
-                <w:lang w:val="en-GB"/>
-              </w:rPr>
-              <w:t>student</w:t>
-            </w:r>
-            <w:proofErr w:type="gramEnd"/>
-            <w:r>
-              <w:rPr>
-                <w:rFonts w:ascii="Verdana" w:hAnsi="Verdana"/>
-                <w:b/>
-                <w:lang w:val="en-GB"/>
-              </w:rPr>
-              <w:t>.</w:t>
-            </w:r>
-            <w:proofErr w:type="gramStart"/>
-            <w:r>
-              <w:rPr>
-                <w:rFonts w:ascii="Verdana" w:hAnsi="Verdana"/>
-                <w:b/>
-                <w:lang w:val="en-GB"/>
-              </w:rPr>
-              <w:t>time</w:t>
-            </w:r>
-            <w:proofErr w:type="spellEnd"/>
-            <w:r>
-              <w:rPr>
-                <w:rFonts w:ascii="Verdana" w:hAnsi="Verdana"/>
-                <w:b/>
-                <w:lang w:val="en-GB"/>
-              </w:rPr>
-              <w:t xml:space="preserve"> }}</w:t>
-            </w:r>
-            <w:r>
-              <w:rPr>
-                <w:rFonts w:ascii="Verdana" w:hAnsi="Verdana"/>
-                <w:b/>
-              </w:rPr>
-              <w:t>{</w:t>
-            </w:r>
-            <w:proofErr w:type="gramEnd"/>
-            <w:r>
-              <w:rPr>
-                <w:rFonts w:ascii="Verdana" w:hAnsi="Verdana"/>
-                <w:b/>
-              </w:rPr>
-              <w:t>%</w:t>
-            </w:r>
-            <w:proofErr w:type="spellStart"/>
-            <w:r>
-              <w:rPr>
-                <w:rFonts w:ascii="Verdana" w:hAnsi="Verdana"/>
-                <w:b/>
-              </w:rPr>
-              <w:t>tr</w:t>
-            </w:r>
-            <w:proofErr w:type="spellEnd"/>
-            <w:r>
-              <w:rPr>
-                <w:rFonts w:ascii="Verdana" w:hAnsi="Verdana"/>
-                <w:b/>
-              </w:rPr>
-              <w:t xml:space="preserve"> </w:t>
-            </w:r>
-            <w:proofErr w:type="spellStart"/>
-            <w:r>
-              <w:rPr>
-                <w:rFonts w:ascii="Verdana" w:hAnsi="Verdana"/>
-                <w:b/>
-              </w:rPr>
-              <w:t>endfor</w:t>
-            </w:r>
-            <w:proofErr w:type="spellEnd"/>
-            <w:r>
-              <w:rPr>
-                <w:rFonts w:ascii="Verdana" w:hAnsi="Verdana"/>
-                <w:b/>
-              </w:rPr>
-              <w:t xml:space="preserve"> %}</w:t>
+              </w:rPr>
+              <w:t>{%tr endfor %}</w:t>
             </w:r>
           </w:p>
         </w:tc>
@@ -3122,55 +2782,7 @@
           <w:rFonts w:ascii="Calibri" w:hAnsi="Calibri"/>
           <w:b/>
         </w:rPr>
-        <w:t xml:space="preserve">{% </w:t>
-      </w:r>
-      <w:proofErr w:type="spellStart"/>
-      <w:r>
-        <w:rPr>
-          <w:rFonts w:ascii="Calibri" w:hAnsi="Calibri"/>
-          <w:b/>
-        </w:rPr>
-        <w:t>for</w:t>
-      </w:r>
-      <w:proofErr w:type="spellEnd"/>
-      <w:r>
-        <w:rPr>
-          <w:rFonts w:ascii="Calibri" w:hAnsi="Calibri"/>
-          <w:b/>
-        </w:rPr>
-        <w:t xml:space="preserve"> </w:t>
-      </w:r>
-      <w:proofErr w:type="spellStart"/>
-      <w:r>
-        <w:rPr>
-          <w:rFonts w:ascii="Calibri" w:hAnsi="Calibri"/>
-          <w:b/>
-        </w:rPr>
-        <w:t>student</w:t>
-      </w:r>
-      <w:proofErr w:type="spellEnd"/>
-      <w:r>
-        <w:rPr>
-          <w:rFonts w:ascii="Calibri" w:hAnsi="Calibri"/>
-          <w:b/>
-        </w:rPr>
-        <w:t xml:space="preserve"> in </w:t>
-      </w:r>
-      <w:proofErr w:type="spellStart"/>
-      <w:r>
-        <w:rPr>
-          <w:rFonts w:ascii="Calibri" w:hAnsi="Calibri"/>
-          <w:b/>
-        </w:rPr>
-        <w:t>students</w:t>
-      </w:r>
-      <w:proofErr w:type="spellEnd"/>
-      <w:r>
-        <w:rPr>
-          <w:rFonts w:ascii="Calibri" w:hAnsi="Calibri"/>
-          <w:b/>
-        </w:rPr>
-        <w:t xml:space="preserve"> %}</w:t>
+        <w:t>{% for student in students %}</w:t>
       </w:r>
     </w:p>
     <w:tbl>
@@ -3259,17 +2871,8 @@
                 <w:rFonts w:ascii="Calibri" w:hAnsi="Calibri"/>
                 <w:b/>
               </w:rPr>
-              <w:t>D.</w:t>
-            </w:r>
-            <w:proofErr w:type="gramStart"/>
-            <w:r>
-              <w:rPr>
-                <w:rFonts w:ascii="Calibri" w:hAnsi="Calibri"/>
-                <w:b/>
-              </w:rPr>
-              <w:t>N.I</w:t>
-            </w:r>
-            <w:proofErr w:type="gramEnd"/>
+              <w:t>D.N.I</w:t>
+            </w:r>
           </w:p>
         </w:tc>
         <w:tc>
@@ -3330,37 +2933,12 @@
                 <w:b/>
               </w:rPr>
             </w:pPr>
-            <w:proofErr w:type="gramStart"/>
-            <w:r>
-              <w:rPr>
-                <w:rFonts w:ascii="Calibri" w:hAnsi="Calibri"/>
-                <w:b/>
-              </w:rPr>
-              <w:t xml:space="preserve">{{ </w:t>
-            </w:r>
-            <w:proofErr w:type="spellStart"/>
-            <w:r>
-              <w:rPr>
-                <w:rFonts w:ascii="Calibri" w:hAnsi="Calibri"/>
-                <w:b/>
-              </w:rPr>
-              <w:t>student</w:t>
-            </w:r>
-            <w:proofErr w:type="gramEnd"/>
-            <w:r>
-              <w:rPr>
-                <w:rFonts w:ascii="Calibri" w:hAnsi="Calibri"/>
-                <w:b/>
-              </w:rPr>
-              <w:t>.lastname</w:t>
-            </w:r>
-            <w:proofErr w:type="spellEnd"/>
-            <w:r>
-              <w:rPr>
-                <w:rFonts w:ascii="Calibri" w:hAnsi="Calibri"/>
-                <w:b/>
-              </w:rPr>
-              <w:t xml:space="preserve"> }}</w:t>
+            <w:r>
+              <w:rPr>
+                <w:rFonts w:ascii="Calibri" w:hAnsi="Calibri"/>
+                <w:b/>
+              </w:rPr>
+              <w:t>{{ student.lastname }}</w:t>
             </w:r>
           </w:p>
         </w:tc>
@@ -3376,7 +2954,6 @@
                 <w:b/>
               </w:rPr>
             </w:pPr>
-            <w:proofErr w:type="gramStart"/>
             <w:r>
               <w:rPr>
                 <w:rFonts w:ascii="Calibri" w:hAnsi="Calibri"/>
@@ -3391,7 +2968,6 @@
               </w:rPr>
               <w:t>name</w:t>
             </w:r>
-            <w:proofErr w:type="gramEnd"/>
             <w:r>
               <w:rPr>
                 <w:rFonts w:ascii="Calibri" w:hAnsi="Calibri"/>
@@ -3412,21 +2988,12 @@
                 <w:b/>
               </w:rPr>
             </w:pPr>
-            <w:proofErr w:type="gramStart"/>
-            <w:r>
-              <w:rPr>
-                <w:rFonts w:ascii="Calibri" w:hAnsi="Calibri"/>
-                <w:b/>
-              </w:rPr>
-              <w:t xml:space="preserve">{{ </w:t>
-            </w:r>
-            <w:proofErr w:type="spellStart"/>
-            <w:r>
-              <w:rPr>
-                <w:rFonts w:ascii="Calibri" w:hAnsi="Calibri"/>
-                <w:b/>
-              </w:rPr>
-              <w:t>student.</w:t>
+            <w:r>
+              <w:rPr>
+                <w:rFonts w:ascii="Calibri" w:hAnsi="Calibri"/>
+                <w:b/>
+              </w:rPr>
+              <w:t>{{ student.</w:t>
             </w:r>
             <w:r>
               <w:rPr>
@@ -3435,8 +3002,6 @@
               </w:rPr>
               <w:t>dni</w:t>
             </w:r>
-            <w:proofErr w:type="spellEnd"/>
-            <w:proofErr w:type="gramEnd"/>
             <w:r>
               <w:rPr>
                 <w:rFonts w:ascii="Calibri" w:hAnsi="Calibri"/>
@@ -3458,29 +3023,12 @@
                 <w:b/>
               </w:rPr>
             </w:pPr>
-            <w:proofErr w:type="gramStart"/>
-            <w:r>
-              <w:rPr>
-                <w:rFonts w:ascii="Calibri" w:hAnsi="Calibri"/>
-                <w:b/>
-              </w:rPr>
-              <w:t xml:space="preserve">{{ </w:t>
-            </w:r>
-            <w:proofErr w:type="spellStart"/>
-            <w:r>
-              <w:rPr>
-                <w:rFonts w:ascii="Calibri" w:hAnsi="Calibri"/>
-                <w:b/>
-              </w:rPr>
-              <w:t>student</w:t>
-            </w:r>
-            <w:proofErr w:type="gramEnd"/>
-            <w:r>
-              <w:rPr>
-                <w:rFonts w:ascii="Calibri" w:hAnsi="Calibri"/>
-                <w:b/>
-              </w:rPr>
-              <w:t>.</w:t>
+            <w:r>
+              <w:rPr>
+                <w:rFonts w:ascii="Calibri" w:hAnsi="Calibri"/>
+                <w:b/>
+              </w:rPr>
+              <w:t>{{ student.</w:t>
             </w:r>
             <w:r>
               <w:rPr>
@@ -3489,7 +3037,6 @@
               </w:rPr>
               <w:t>mail</w:t>
             </w:r>
-            <w:proofErr w:type="spellEnd"/>
             <w:r>
               <w:rPr>
                 <w:rFonts w:ascii="Calibri" w:hAnsi="Calibri"/>
@@ -3510,37 +3057,12 @@
                 <w:b/>
               </w:rPr>
             </w:pPr>
-            <w:proofErr w:type="gramStart"/>
-            <w:r>
-              <w:rPr>
-                <w:rFonts w:ascii="Calibri" w:hAnsi="Calibri"/>
-                <w:b/>
-              </w:rPr>
-              <w:t xml:space="preserve">{{ </w:t>
-            </w:r>
-            <w:proofErr w:type="spellStart"/>
-            <w:r>
-              <w:rPr>
-                <w:rFonts w:ascii="Calibri" w:hAnsi="Calibri"/>
-                <w:b/>
-              </w:rPr>
-              <w:t>student</w:t>
-            </w:r>
-            <w:proofErr w:type="gramEnd"/>
-            <w:r>
-              <w:rPr>
-                <w:rFonts w:ascii="Calibri" w:hAnsi="Calibri"/>
-                <w:b/>
-              </w:rPr>
-              <w:t>.movil</w:t>
-            </w:r>
-            <w:proofErr w:type="spellEnd"/>
-            <w:r>
-              <w:rPr>
-                <w:rFonts w:ascii="Calibri" w:hAnsi="Calibri"/>
-                <w:b/>
-              </w:rPr>
-              <w:t xml:space="preserve"> }}</w:t>
+            <w:r>
+              <w:rPr>
+                <w:rFonts w:ascii="Calibri" w:hAnsi="Calibri"/>
+                <w:b/>
+              </w:rPr>
+              <w:t>{{ student.movil }}</w:t>
             </w:r>
           </w:p>
         </w:tc>
@@ -3629,53 +3151,12 @@
                 <w:b/>
               </w:rPr>
             </w:pPr>
-            <w:proofErr w:type="gramStart"/>
-            <w:r>
-              <w:rPr>
-                <w:rFonts w:ascii="Calibri" w:hAnsi="Calibri"/>
-                <w:b/>
-              </w:rPr>
-              <w:t xml:space="preserve">{{ </w:t>
-            </w:r>
-            <w:proofErr w:type="spellStart"/>
-            <w:r>
-              <w:rPr>
-                <w:rFonts w:ascii="Calibri" w:hAnsi="Calibri"/>
-                <w:b/>
-              </w:rPr>
-              <w:t>student</w:t>
-            </w:r>
-            <w:proofErr w:type="gramEnd"/>
-            <w:r>
-              <w:rPr>
-                <w:rFonts w:ascii="Calibri" w:hAnsi="Calibri"/>
-                <w:b/>
-              </w:rPr>
-              <w:t>.</w:t>
-            </w:r>
-            <w:proofErr w:type="gramStart"/>
-            <w:r>
-              <w:rPr>
-                <w:rFonts w:ascii="Calibri" w:hAnsi="Calibri"/>
-                <w:b/>
-              </w:rPr>
-              <w:t>firstconection</w:t>
-            </w:r>
-            <w:proofErr w:type="spellEnd"/>
-            <w:r>
-              <w:rPr>
-                <w:rFonts w:ascii="Calibri" w:hAnsi="Calibri"/>
-                <w:b/>
-              </w:rPr>
-              <w:t xml:space="preserve"> }</w:t>
-            </w:r>
-            <w:proofErr w:type="gramEnd"/>
-            <w:r>
-              <w:rPr>
-                <w:rFonts w:ascii="Calibri" w:hAnsi="Calibri"/>
-                <w:b/>
-              </w:rPr>
-              <w:t>}</w:t>
+            <w:r>
+              <w:rPr>
+                <w:rFonts w:ascii="Calibri" w:hAnsi="Calibri"/>
+                <w:b/>
+              </w:rPr>
+              <w:t>{{ student.firstconection }}</w:t>
             </w:r>
           </w:p>
           <w:p>
@@ -3699,37 +3180,12 @@
                 <w:b/>
               </w:rPr>
             </w:pPr>
-            <w:proofErr w:type="gramStart"/>
-            <w:r>
-              <w:rPr>
-                <w:rFonts w:ascii="Calibri" w:hAnsi="Calibri"/>
-                <w:b/>
-              </w:rPr>
-              <w:t xml:space="preserve">{{ </w:t>
-            </w:r>
-            <w:proofErr w:type="spellStart"/>
-            <w:r>
-              <w:rPr>
-                <w:rFonts w:ascii="Calibri" w:hAnsi="Calibri"/>
-                <w:b/>
-              </w:rPr>
-              <w:t>student</w:t>
-            </w:r>
-            <w:proofErr w:type="gramEnd"/>
-            <w:r>
-              <w:rPr>
-                <w:rFonts w:ascii="Calibri" w:hAnsi="Calibri"/>
-                <w:b/>
-              </w:rPr>
-              <w:t>.time</w:t>
-            </w:r>
-            <w:proofErr w:type="spellEnd"/>
-            <w:r>
-              <w:rPr>
-                <w:rFonts w:ascii="Calibri" w:hAnsi="Calibri"/>
-                <w:b/>
-              </w:rPr>
-              <w:t xml:space="preserve"> }}</w:t>
+            <w:r>
+              <w:rPr>
+                <w:rFonts w:ascii="Calibri" w:hAnsi="Calibri"/>
+                <w:b/>
+              </w:rPr>
+              <w:t>{{ student.time }}</w:t>
             </w:r>
           </w:p>
         </w:tc>
@@ -3745,30 +3201,12 @@
                 <w:b/>
               </w:rPr>
             </w:pPr>
-            <w:proofErr w:type="gramStart"/>
-            <w:r>
-              <w:rPr>
-                <w:rFonts w:ascii="Calibri" w:hAnsi="Calibri"/>
-                <w:b/>
-              </w:rPr>
-              <w:t xml:space="preserve">{{ </w:t>
-            </w:r>
-            <w:proofErr w:type="spellStart"/>
-            <w:r>
-              <w:rPr>
-                <w:rFonts w:ascii="Calibri" w:hAnsi="Calibri"/>
-                <w:b/>
-              </w:rPr>
-              <w:t>student.evf</w:t>
-            </w:r>
-            <w:proofErr w:type="spellEnd"/>
-            <w:proofErr w:type="gramEnd"/>
-            <w:r>
-              <w:rPr>
-                <w:rFonts w:ascii="Calibri" w:hAnsi="Calibri"/>
-                <w:b/>
-              </w:rPr>
-              <w:t xml:space="preserve"> }}</w:t>
+            <w:r>
+              <w:rPr>
+                <w:rFonts w:ascii="Calibri" w:hAnsi="Calibri"/>
+                <w:b/>
+              </w:rPr>
+              <w:t>{{ student.evf }}</w:t>
             </w:r>
           </w:p>
         </w:tc>
@@ -3798,153 +3236,50 @@
             <w:r>
               <w:t xml:space="preserve"> </w:t>
             </w:r>
-            <w:proofErr w:type="gramStart"/>
             <w:r>
               <w:rPr>
                 <w:rFonts w:ascii="Calibri" w:hAnsi="Calibri"/>
                 <w:b/>
                 <w:sz w:val="18"/>
               </w:rPr>
-              <w:t>{{ student.ev1</w:t>
-            </w:r>
-            <w:proofErr w:type="gramEnd"/>
-            <w:r>
+              <w:t>{{ student.ev1 }}</w:t>
+            </w:r>
+          </w:p>
+          <w:p>
+            <w:pPr>
               <w:rPr>
                 <w:rFonts w:ascii="Calibri" w:hAnsi="Calibri"/>
                 <w:b/>
                 <w:sz w:val="18"/>
               </w:rPr>
-              <w:t xml:space="preserve"> }}</w:t>
-            </w:r>
-          </w:p>
-          <w:p>
-            <w:pPr>
+            </w:pPr>
+            <w:r>
               <w:rPr>
                 <w:rFonts w:ascii="Calibri" w:hAnsi="Calibri"/>
                 <w:b/>
                 <w:sz w:val="18"/>
               </w:rPr>
-            </w:pPr>
+              <w:t>Evaluación Módulo 2                                 Nota:</w:t>
+            </w:r>
+            <w:r>
+              <w:t xml:space="preserve"> </w:t>
+            </w:r>
             <w:r>
               <w:rPr>
                 <w:rFonts w:ascii="Calibri" w:hAnsi="Calibri"/>
                 <w:b/>
                 <w:sz w:val="18"/>
               </w:rPr>
-              <w:t>Evaluación Módulo 2                                 Nota:</w:t>
-            </w:r>
-            <w:r>
-              <w:t xml:space="preserve"> </w:t>
-            </w:r>
-            <w:proofErr w:type="gramStart"/>
+              <w:t>{{ student.ev</w:t>
+            </w:r>
             <w:r>
               <w:rPr>
                 <w:rFonts w:ascii="Calibri" w:hAnsi="Calibri"/>
                 <w:b/>
                 <w:sz w:val="18"/>
               </w:rPr>
-              <w:t>{{ student.ev</w:t>
-            </w:r>
-            <w:r>
-              <w:rPr>
-                <w:rFonts w:ascii="Calibri" w:hAnsi="Calibri"/>
-                <w:b/>
-                <w:sz w:val="18"/>
-              </w:rPr>
               <w:t>2</w:t>
             </w:r>
-            <w:proofErr w:type="gramEnd"/>
-            <w:r>
-              <w:rPr>
-                <w:rFonts w:ascii="Calibri" w:hAnsi="Calibri"/>
-                <w:b/>
-                <w:sz w:val="18"/>
-              </w:rPr>
-              <w:t xml:space="preserve"> }}</w:t>
-            </w:r>
-          </w:p>
-          <w:p>
-            <w:pPr>
-              <w:rPr>
-                <w:rFonts w:ascii="Calibri" w:hAnsi="Calibri"/>
-                <w:b/>
-                <w:sz w:val="18"/>
-              </w:rPr>
-            </w:pPr>
-            <w:r>
-              <w:rPr>
-                <w:rFonts w:ascii="Calibri" w:hAnsi="Calibri"/>
-                <w:b/>
-                <w:sz w:val="18"/>
-              </w:rPr>
-              <w:t>Evaluación Módulo 3                                 Nota:</w:t>
-            </w:r>
-            <w:r>
-              <w:t xml:space="preserve"> </w:t>
-            </w:r>
-            <w:proofErr w:type="gramStart"/>
-            <w:r>
-              <w:rPr>
-                <w:rFonts w:ascii="Calibri" w:hAnsi="Calibri"/>
-                <w:b/>
-                <w:sz w:val="18"/>
-              </w:rPr>
-              <w:t>{{ student.ev</w:t>
-            </w:r>
-            <w:r>
-              <w:rPr>
-                <w:rFonts w:ascii="Calibri" w:hAnsi="Calibri"/>
-                <w:b/>
-                <w:sz w:val="18"/>
-              </w:rPr>
-              <w:t>3</w:t>
-            </w:r>
-            <w:proofErr w:type="gramEnd"/>
-            <w:r>
-              <w:rPr>
-                <w:rFonts w:ascii="Calibri" w:hAnsi="Calibri"/>
-                <w:b/>
-                <w:sz w:val="18"/>
-              </w:rPr>
-              <w:t xml:space="preserve"> }}</w:t>
-            </w:r>
-          </w:p>
-          <w:p>
-            <w:pPr>
-              <w:rPr>
-                <w:rFonts w:ascii="Calibri" w:hAnsi="Calibri"/>
-                <w:b/>
-              </w:rPr>
-            </w:pPr>
-            <w:r>
-              <w:rPr>
-                <w:rFonts w:ascii="Calibri" w:hAnsi="Calibri"/>
-                <w:b/>
-                <w:sz w:val="18"/>
-              </w:rPr>
-              <w:t>Evaluación Módulo 4                                 Nota:</w:t>
-            </w:r>
-            <w:r>
-              <w:t xml:space="preserve"> </w:t>
-            </w:r>
-            <w:proofErr w:type="gramStart"/>
-            <w:r>
-              <w:rPr>
-                <w:rFonts w:ascii="Calibri" w:hAnsi="Calibri"/>
-                <w:b/>
-                <w:sz w:val="18"/>
-              </w:rPr>
-              <w:t>{{ student.ev</w:t>
-            </w:r>
-            <w:r>
-              <w:rPr>
-                <w:rFonts w:ascii="Calibri" w:hAnsi="Calibri"/>
-                <w:b/>
-                <w:sz w:val="18"/>
-              </w:rPr>
-              <w:t>4</w:t>
-            </w:r>
-            <w:proofErr w:type="gramEnd"/>
             <w:r>
               <w:rPr>
                 <w:rFonts w:ascii="Calibri" w:hAnsi="Calibri"/>
@@ -3959,15 +3294,7 @@
     </w:tbl>
     <w:p>
       <w:r>
-        <w:t xml:space="preserve">{% </w:t>
-      </w:r>
-      <w:proofErr w:type="spellStart"/>
-      <w:r>
-        <w:t>endfor</w:t>
-      </w:r>
-      <w:proofErr w:type="spellEnd"/>
-      <w:r>
-        <w:t xml:space="preserve"> %}</w:t>
+        <w:t>{% endfor %}</w:t>
       </w:r>
     </w:p>
     <w:sectPr>
@@ -4215,7 +3542,7 @@
           <v:path o:extrusionok="f" gradientshapeok="t" o:connecttype="rect"/>
           <o:lock v:ext="edit" aspectratio="t"/>
         </v:shapetype>
-        <v:shape id="_x0000_i1029" type="#_x0000_t75" alt="logo_g" style="width:154.8pt;height:76.2pt;visibility:visible">
+        <v:shape id="_x0000_i1030" type="#_x0000_t75" alt="logo_g" style="width:154.8pt;height:76.2pt;visibility:visible">
           <v:imagedata r:id="rId1" o:title="logo_g"/>
         </v:shape>
       </w:pict>
@@ -4259,7 +3586,7 @@
               <w:p>
                 <w:r>
                   <w:pict w14:anchorId="579FC6A6">
-                    <v:shape id="_x0000_i1030" type="#_x0000_t75" style="width:92.4pt;height:113.4pt">
+                    <v:shape id="_x0000_i1032" type="#_x0000_t75" style="width:92.4pt;height:113.4pt">
                       <v:imagedata r:id="rId2" o:title="escudo-con letra"/>
                     </v:shape>
                   </w:pict>
@@ -5100,6 +4427,50 @@
     <w:lsdException w:name="Subtitle" w:qFormat="1"/>
     <w:lsdException w:name="Strong" w:qFormat="1"/>
     <w:lsdException w:name="Emphasis" w:qFormat="1"/>
+    <w:lsdException w:name="Normal Table" w:semiHidden="1" w:unhideWhenUsed="1"/>
+    <w:lsdException w:name="Table Simple 1" w:semiHidden="1" w:unhideWhenUsed="1"/>
+    <w:lsdException w:name="Table Simple 2" w:semiHidden="1" w:unhideWhenUsed="1"/>
+    <w:lsdException w:name="Table Simple 3" w:semiHidden="1" w:unhideWhenUsed="1"/>
+    <w:lsdException w:name="Table Classic 1" w:semiHidden="1" w:unhideWhenUsed="1"/>
+    <w:lsdException w:name="Table Classic 2" w:semiHidden="1" w:unhideWhenUsed="1"/>
+    <w:lsdException w:name="Table Classic 3" w:semiHidden="1" w:unhideWhenUsed="1"/>
+    <w:lsdException w:name="Table Classic 4" w:semiHidden="1" w:unhideWhenUsed="1"/>
+    <w:lsdException w:name="Table Colorful 1" w:semiHidden="1" w:unhideWhenUsed="1"/>
+    <w:lsdException w:name="Table Colorful 2" w:semiHidden="1" w:unhideWhenUsed="1"/>
+    <w:lsdException w:name="Table Colorful 3" w:semiHidden="1" w:unhideWhenUsed="1"/>
+    <w:lsdException w:name="Table Columns 1" w:semiHidden="1" w:unhideWhenUsed="1"/>
+    <w:lsdException w:name="Table Columns 2" w:semiHidden="1" w:unhideWhenUsed="1"/>
+    <w:lsdException w:name="Table Columns 3" w:semiHidden="1" w:unhideWhenUsed="1"/>
+    <w:lsdException w:name="Table Columns 4" w:semiHidden="1" w:unhideWhenUsed="1"/>
+    <w:lsdException w:name="Table Columns 5" w:semiHidden="1" w:unhideWhenUsed="1"/>
+    <w:lsdException w:name="Table Grid 1" w:semiHidden="1" w:unhideWhenUsed="1"/>
+    <w:lsdException w:name="Table Grid 2" w:semiHidden="1" w:unhideWhenUsed="1"/>
+    <w:lsdException w:name="Table Grid 3" w:semiHidden="1" w:unhideWhenUsed="1"/>
+    <w:lsdException w:name="Table Grid 4" w:semiHidden="1" w:unhideWhenUsed="1"/>
+    <w:lsdException w:name="Table Grid 5" w:semiHidden="1" w:unhideWhenUsed="1"/>
+    <w:lsdException w:name="Table Grid 6" w:semiHidden="1" w:unhideWhenUsed="1"/>
+    <w:lsdException w:name="Table Grid 7" w:semiHidden="1" w:unhideWhenUsed="1"/>
+    <w:lsdException w:name="Table Grid 8" w:semiHidden="1" w:unhideWhenUsed="1"/>
+    <w:lsdException w:name="Table List 1" w:semiHidden="1" w:unhideWhenUsed="1"/>
+    <w:lsdException w:name="Table List 2" w:semiHidden="1" w:unhideWhenUsed="1"/>
+    <w:lsdException w:name="Table List 3" w:semiHidden="1" w:unhideWhenUsed="1"/>
+    <w:lsdException w:name="Table List 4" w:semiHidden="1" w:unhideWhenUsed="1"/>
+    <w:lsdException w:name="Table List 5" w:semiHidden="1" w:unhideWhenUsed="1"/>
+    <w:lsdException w:name="Table List 6" w:semiHidden="1" w:unhideWhenUsed="1"/>
+    <w:lsdException w:name="Table List 7" w:semiHidden="1" w:unhideWhenUsed="1"/>
+    <w:lsdException w:name="Table List 8" w:semiHidden="1" w:unhideWhenUsed="1"/>
+    <w:lsdException w:name="Table 3D effects 1" w:semiHidden="1" w:unhideWhenUsed="1"/>
+    <w:lsdException w:name="Table 3D effects 2" w:semiHidden="1" w:unhideWhenUsed="1"/>
+    <w:lsdException w:name="Table 3D effects 3" w:semiHidden="1" w:unhideWhenUsed="1"/>
+    <w:lsdException w:name="Table Contemporary" w:semiHidden="1" w:unhideWhenUsed="1"/>
+    <w:lsdException w:name="Table Elegant" w:semiHidden="1" w:unhideWhenUsed="1"/>
+    <w:lsdException w:name="Table Professional" w:semiHidden="1" w:unhideWhenUsed="1"/>
+    <w:lsdException w:name="Table Subtle 1" w:semiHidden="1" w:unhideWhenUsed="1"/>
+    <w:lsdException w:name="Table Subtle 2" w:semiHidden="1" w:unhideWhenUsed="1"/>
+    <w:lsdException w:name="Table Web 1" w:semiHidden="1" w:unhideWhenUsed="1"/>
+    <w:lsdException w:name="Table Web 2" w:semiHidden="1" w:unhideWhenUsed="1"/>
+    <w:lsdException w:name="Table Web 3" w:semiHidden="1" w:unhideWhenUsed="1"/>
+    <w:lsdException w:name="Table Theme" w:semiHidden="1" w:unhideWhenUsed="1"/>
     <w:lsdException w:name="Placeholder Text" w:semiHidden="1" w:uiPriority="99"/>
     <w:lsdException w:name="No Spacing" w:uiPriority="1" w:qFormat="1"/>
     <w:lsdException w:name="Light Shading" w:uiPriority="60"/>
@@ -5331,11 +4702,15 @@
   </w:style>
   <w:style w:type="character" w:default="1" w:styleId="Fuentedeprrafopredeter">
     <w:name w:val="Default Paragraph Font"/>
+    <w:uiPriority w:val="1"/>
     <w:semiHidden/>
+    <w:unhideWhenUsed/>
   </w:style>
   <w:style w:type="table" w:default="1" w:styleId="Tablanormal">
     <w:name w:val="Normal Table"/>
+    <w:uiPriority w:val="99"/>
     <w:semiHidden/>
+    <w:unhideWhenUsed/>
     <w:tblPr>
       <w:tblInd w:w="0" w:type="dxa"/>
       <w:tblCellMar>
@@ -5348,7 +4723,9 @@
   </w:style>
   <w:style w:type="numbering" w:default="1" w:styleId="Sinlista">
     <w:name w:val="No List"/>
+    <w:uiPriority w:val="99"/>
     <w:semiHidden/>
+    <w:unhideWhenUsed/>
   </w:style>
   <w:style w:type="paragraph" w:styleId="Textodeglobo">
     <w:name w:val="Balloon Text"/>
@@ -5369,7 +4746,7 @@
       <w:spacing w:before="100" w:beforeAutospacing="1" w:after="100" w:afterAutospacing="1"/>
     </w:pPr>
   </w:style>
-  <w:style w:type="character" w:styleId="Textoennegrita">
+  <w:style w:type="character" w:customStyle="1" w:styleId="Textoennegrita">
     <w:name w:val="Texto en negrita"/>
     <w:qFormat/>
     <w:rsid w:val="001F268B"/>

</xml_diff>